<commit_message>
Offerta FS-11-17 aggiornata con dati reali + analisi impianto e piano manutenzione dal manuale
Analisi di schema elettrico V106, oleodinamica Phs3297 e manuale U&M
(cap. 0-10): offerta riallineata all'architettura installata (2 ATV930,
soft starter 37 kW, PSSu multi, proporzionale, collettore rotante),
piano manutenzione con le frequenze ufficiali del cap. 6 e nuove
opzioni (revisione collettore, contratto ispezione annuale).

Co-Authored-By: Claude Fable 5 <noreply@anthropic.com>
Claude-Session: https://claude.ai/code/session_011dTkVKp5eCS2ErXRgtaBE2
</commit_message>
<xml_diff>
--- a/offers/FS-11-17-volare-control-system/OFFER_FS-11-17_Control_System_EN.docx
+++ b/offers/FS-11-17-volare-control-system/OFFER_FS-11-17_Control_System_EN.docx
@@ -54,7 +54,7 @@
         <w:t>Our reference:</w:t>
       </w:r>
       <w:r>
-        <w:t xml:space="preserve"> Job FS-11-17 – Flying Swinger "Volaré"</w:t>
+        <w:t xml:space="preserve"> Job FS-11-17 – Flying Swinger "Volaré" 64 seats</w:t>
       </w:r>
       <w:r>
         <w:br/>
@@ -140,12 +140,12 @@
         <w:t>"Volaré"</w:t>
       </w:r>
       <w:r>
-        <w:t xml:space="preserve"> (our job FS-11-17), installed at Luna Park Sydney, Milsons Point NSW, Australia.</w:t>
+        <w:t xml:space="preserve"> (our job FS-11-17, 64 seats), installed at Luna Park Sydney, Milsons Point NSW, Australia.</w:t>
       </w:r>
     </w:p>
     <w:p>
       <w:r>
-        <w:t xml:space="preserve">The new control system is designed as a direct replacement of the existing installation and complies with the latest editions of the applicable standards for amusement rides, namely </w:t>
+        <w:t xml:space="preserve">The new control system is designed as a direct replacement of the existing installation (electrical project FS11_17_AUS, year 2018) and complies with the latest editions of the applicable standards for amusement rides, namely </w:t>
       </w:r>
       <w:r>
         <w:rPr>
@@ -189,7 +189,60 @@
         <w:pStyle w:val="Heading2"/>
       </w:pPr>
       <w:r>
-        <w:t>1. Scope of Supply</w:t>
+        <w:t>1. Reference data of the existing installation</w:t>
+      </w:r>
+    </w:p>
+    <w:p>
+      <w:pPr>
+        <w:pStyle w:val="ListBullet"/>
+      </w:pPr>
+      <w:r>
+        <w:t>Supply: 400 V + N, 50 Hz – required power 90 kW – main switch 160 A, Icc 25 kA – control voltage 24 V dc.</w:t>
+      </w:r>
+    </w:p>
+    <w:p>
+      <w:pPr>
+        <w:pStyle w:val="ListBullet"/>
+      </w:pPr>
+      <w:r>
+        <w:t>Drives: pole rotation motor 15 kW (inverter duty, with braking resistor), roof rotation motor 30 kW (inverter duty, with braking resistor, supplied through slip-ring collector), hydraulic pump motor 37 kW (soft starter), heat-exchanger fan 0.5 kW, oil heater 0.6 kW.</w:t>
+      </w:r>
+    </w:p>
+    <w:p>
+      <w:pPr>
+        <w:pStyle w:val="ListBullet"/>
+      </w:pPr>
+      <w:r>
+        <w:t>Hydraulic power unit (lifting/tilting): proportional directional valve (±10 V reference), No. 7 on/off solenoid valves 24 V dc, No. 3 pressure switches, No. 2 pressure transducers 4–20 mA, oil temperature and level monitoring, emergency descent circuit.</w:t>
+      </w:r>
+    </w:p>
+    <w:p>
+      <w:pPr>
+        <w:pStyle w:val="ListBullet"/>
+      </w:pPr>
+      <w:r>
+        <w:t>Safety functions: emergency stop, dual-channel cycle start, motor brakes control, restraint (seat belts / lap-bars) monitoring with belt-opening interlock, over-speed and minimum-speed monitoring, Safe Torque Off on both rotation drives, emergency descent by gravity.</w:t>
+      </w:r>
+    </w:p>
+    <w:p>
+      <w:pPr>
+        <w:pStyle w:val="ListBullet"/>
+      </w:pPr>
+      <w:r>
+        <w:t>Panels: main cabinet (1600×2100×600, IP56 outdoor), operator control console, hydraulic unit distribution panel, base and column junction boxes, roof distribution panel with light transformers.</w:t>
+      </w:r>
+    </w:p>
+    <w:p>
+      <w:r>
+        <w:t>The new control system will reproduce all existing ride functions and operating cycles, so that no re-training of operators beyond the commissioning training is required.</w:t>
+      </w:r>
+    </w:p>
+    <w:p>
+      <w:pPr>
+        <w:pStyle w:val="Heading2"/>
+      </w:pPr>
+      <w:r>
+        <w:t>2. Scope of Supply</w:t>
       </w:r>
     </w:p>
     <w:p>
@@ -197,7 +250,7 @@
         <w:pStyle w:val="Heading3"/>
       </w:pPr>
       <w:r>
-        <w:t>1.1 Main Control Cabinet</w:t>
+        <w:t>2.1 Main Control Cabinet (replacing existing QG)</w:t>
       </w:r>
     </w:p>
     <w:p>
@@ -205,7 +258,7 @@
         <w:pStyle w:val="ListBullet"/>
       </w:pPr>
       <w:r>
-        <w:t>New main electrical cabinet, painted steel construction, protection degree IP54, complete with anti-condensation heating and thermostatically controlled ventilation / air-conditioning unit suitable for outdoor marine environment (Sydney Harbour location).</w:t>
+        <w:t>New main electrical cabinet, painted steel construction, protection degree IP56, complete with anti-condensation heating and thermostatically controlled air-conditioning unit suitable for outdoor marine environment (Sydney Harbour location).</w:t>
       </w:r>
     </w:p>
     <w:p>
@@ -222,7 +275,7 @@
         <w:t>Siemens SIMATIC S7-1500F</w:t>
       </w:r>
       <w:r>
-        <w:t xml:space="preserve"> series with fail-safe I/O modules, performing all ride control and safety functions (Performance Level "d", Cat. 3 acc. to EN ISO 13849-1).</w:t>
+        <w:t xml:space="preserve"> series with fail-safe I/O, performing all ride control and safety functions (Performance Level "d", Cat. 3 acc. to EN ISO 13849-1). On request, a like-for-like architecture based on the original platform (Pilz PSS / Schneider) can be quoted as an alternative.</w:t>
       </w:r>
     </w:p>
     <w:p>
@@ -230,16 +283,23 @@
         <w:pStyle w:val="ListBullet"/>
       </w:pPr>
       <w:r>
-        <w:t xml:space="preserve">Variable frequency drives </w:t>
+        <w:t>No. 2 variable frequency drives with Safe Torque Off and braking resistors:</w:t>
       </w:r>
+    </w:p>
+    <w:p>
+      <w:pPr>
+        <w:pStyle w:val="ListBullet2"/>
+      </w:pPr>
       <w:r>
-        <w:rPr>
-          <w:b/>
-        </w:rPr>
-        <w:t>Siemens SINAMICS</w:t>
+        <w:t>pole rotation: 15 kW class, braking resistor ≥5 kW;</w:t>
       </w:r>
+    </w:p>
+    <w:p>
+      <w:pPr>
+        <w:pStyle w:val="ListBullet2"/>
+      </w:pPr>
       <w:r>
-        <w:t xml:space="preserve"> series for the main rotation drive motors, complete with line reactors and EMC filters.</w:t>
+        <w:t>roof rotation: 30 kW class, braking resistor ≥10 kW.</w:t>
       </w:r>
     </w:p>
     <w:p>
@@ -247,7 +307,7 @@
         <w:pStyle w:val="ListBullet"/>
       </w:pPr>
       <w:r>
-        <w:t>Motor protection, switchgear and control gear (Siemens / Schneider Electric).</w:t>
+        <w:t>Soft starter for the 37 kW hydraulic pump motor; motor starters for heat-exchanger fan and oil heater.</w:t>
       </w:r>
     </w:p>
     <w:p>
@@ -255,7 +315,7 @@
         <w:pStyle w:val="ListBullet"/>
       </w:pPr>
       <w:r>
-        <w:t>UPS unit for control circuits and safe ride stop in case of mains failure.</w:t>
+        <w:t>Main switch 160 A with undervoltage release, earth-leakage protection by external toroid and residual-current relay (0.3 A, &lt;40 ms), dedicated RCDs for light lines and service circuits, as per existing protection scheme.</w:t>
       </w:r>
     </w:p>
     <w:p>
@@ -263,7 +323,23 @@
         <w:pStyle w:val="ListBullet"/>
       </w:pPr>
       <w:r>
-        <w:t>Industrial VPN router for remote diagnostics and tele-assistance from our factory.</w:t>
+        <w:t>Light-lines distribution section (roof, pole, fixed well, lap-bars lighting) with contactors and protections; interface to existing roof light transformers.</w:t>
+      </w:r>
+    </w:p>
+    <w:p>
+      <w:pPr>
+        <w:pStyle w:val="ListBullet"/>
+      </w:pPr>
+      <w:r>
+        <w:t>UPS for control circuits and safe ride stop / restraint release in case of mains failure; new 24 V dc regulated power supply.</w:t>
+      </w:r>
+    </w:p>
+    <w:p>
+      <w:pPr>
+        <w:pStyle w:val="ListBullet"/>
+      </w:pPr>
+      <w:r>
+        <w:t>Industrial VPN router for remote diagnostics and tele-assistance from our factory (replacing the existing teleservice unit), plus managed Ethernet switch for drives, HMI and PLC network.</w:t>
       </w:r>
     </w:p>
     <w:p>
@@ -271,7 +347,7 @@
         <w:pStyle w:val="Heading3"/>
       </w:pPr>
       <w:r>
-        <w:t>1.2 Operator Console</w:t>
+        <w:t>2.2 Operator Console (replacing existing console)</w:t>
       </w:r>
     </w:p>
     <w:p>
@@ -279,7 +355,7 @@
         <w:pStyle w:val="ListBullet"/>
       </w:pPr>
       <w:r>
-        <w:t>New operator control desk with:</w:t>
+        <w:t>New operator control desk, IP66, outdoor rated, with:</w:t>
       </w:r>
     </w:p>
     <w:p>
@@ -287,16 +363,7 @@
         <w:pStyle w:val="ListBullet2"/>
       </w:pPr>
       <w:r>
-        <w:t xml:space="preserve">colour touch-screen HMI panel </w:t>
-      </w:r>
-      <w:r>
-        <w:rPr>
-          <w:b/>
-        </w:rPr>
-        <w:t>Siemens SIMATIC Comfort</w:t>
-      </w:r>
-      <w:r>
-        <w:t xml:space="preserve"> series [12"];</w:t>
+        <w:t>colour touch-screen HMI panel [12"] with ride status display, cycle selection, alarm list and event log, hour and cycle counters with scheduled-maintenance reminders (as per O&amp;M manual intervals) and exportable event history in support of the log book required by AS 3533.2, multi-language (English / Italian);</w:t>
       </w:r>
     </w:p>
     <w:p>
@@ -304,7 +371,7 @@
         <w:pStyle w:val="ListBullet2"/>
       </w:pPr>
       <w:r>
-        <w:t>hardwired pushbuttons for start / stop / reset, key-operated selector switches (manual / automatic / maintenance mode);</w:t>
+        <w:t>hardwired devices reproducing the existing operating functions: emergency stop, dual-channel cycle start pushbuttons, key-operated emergency reset, key-operated emergency descent, restraint (safety belts) opening pushbutton, cycle stop pushbutton, horn, restraint/lap-bars status lamp;</w:t>
       </w:r>
     </w:p>
     <w:p>
@@ -312,15 +379,15 @@
         <w:pStyle w:val="ListBullet2"/>
       </w:pPr>
       <w:r>
-        <w:t>emergency stop devices acc. to EN 13850;</w:t>
+        <w:t>emergency stop devices acc. to EN ISO 13850.</w:t>
       </w:r>
     </w:p>
     <w:p>
       <w:pPr>
-        <w:pStyle w:val="ListBullet2"/>
+        <w:pStyle w:val="Heading3"/>
       </w:pPr>
       <w:r>
-        <w:t>status and alarm indication lamps.</w:t>
+        <w:t>2.3 Hydraulic Power Unit Interface and Field Equipment</w:t>
       </w:r>
     </w:p>
     <w:p>
@@ -328,7 +395,39 @@
         <w:pStyle w:val="ListBullet"/>
       </w:pPr>
       <w:r>
-        <w:t>HMI application with ride status display, cycle selection, alarm list and log, maintenance counters, multi-language (English / Italian).</w:t>
+        <w:t>Complete control of the existing Power Hydraulik power unit (Phs3297): proportional valve reference (±10 V), No. 7 solenoid valve outputs, acquisition of No. 3 pressure switches, No. 2 pressure transducers (4–20 mA), oil temperature and level, filter clogging indicators; management of oil heater, cooling fan and emergency descent sequence.</w:t>
+      </w:r>
+    </w:p>
+    <w:p>
+      <w:pPr>
+        <w:pStyle w:val="ListBullet"/>
+      </w:pPr>
+      <w:r>
+        <w:t>New hydraulic unit distribution panel (replacing existing UB101).</w:t>
+      </w:r>
+    </w:p>
+    <w:p>
+      <w:pPr>
+        <w:pStyle w:val="ListBullet"/>
+      </w:pPr>
+      <w:r>
+        <w:t>Set of new position and speed detection devices on the rotation axes (encoder / proximity switches) as required by the safety functions; speed and over-speed monitoring implemented in the safety PLC.</w:t>
+      </w:r>
+    </w:p>
+    <w:p>
+      <w:pPr>
+        <w:pStyle w:val="ListBullet"/>
+      </w:pPr>
+      <w:r>
+        <w:t>Motor brakes control (base, pole, roof) and restraint belt-opening actuators control, maintaining the existing interlocking logic through the slip-ring collector.</w:t>
+      </w:r>
+    </w:p>
+    <w:p>
+      <w:pPr>
+        <w:pStyle w:val="ListBullet"/>
+      </w:pPr>
+      <w:r>
+        <w:t>Existing motors, brakes, hydraulic power unit, field sensors, junction boxes and power/signal cabling will be reused subject to inspection at site; new terminal boxes or cables, where found necessary, will be quoted separately.</w:t>
       </w:r>
     </w:p>
     <w:p>
@@ -336,47 +435,7 @@
         <w:pStyle w:val="Heading3"/>
       </w:pPr>
       <w:r>
-        <w:t>1.3 Field Equipment</w:t>
-      </w:r>
-    </w:p>
-    <w:p>
-      <w:pPr>
-        <w:pStyle w:val="ListBullet"/>
-      </w:pPr>
-      <w:r>
-        <w:t>Set of new position and speed detection devices (absolute encoder on main rotation, inductive proximity switches, zero-position reference).</w:t>
-      </w:r>
-    </w:p>
-    <w:p>
-      <w:pPr>
-        <w:pStyle w:val="ListBullet"/>
-      </w:pPr>
-      <w:r>
-        <w:t>Speed and over-speed monitoring implemented in the safety PLC.</w:t>
-      </w:r>
-    </w:p>
-    <w:p>
-      <w:pPr>
-        <w:pStyle w:val="ListBullet"/>
-      </w:pPr>
-      <w:r>
-        <w:t>New junction boxes and terminal boxes, IP65, suitable for outdoor marine environment.</w:t>
-      </w:r>
-    </w:p>
-    <w:p>
-      <w:pPr>
-        <w:pStyle w:val="ListBullet"/>
-      </w:pPr>
-      <w:r>
-        <w:t>[Wind speed sensor (anemometer) with automatic operating limits – see Options]</w:t>
-      </w:r>
-    </w:p>
-    <w:p>
-      <w:pPr>
-        <w:pStyle w:val="Heading3"/>
-      </w:pPr>
-      <w:r>
-        <w:t>1.4 Software and Engineering</w:t>
+        <w:t>2.4 Software and Engineering</w:t>
       </w:r>
     </w:p>
     <w:p>
@@ -408,7 +467,7 @@
         <w:pStyle w:val="Heading3"/>
       </w:pPr>
       <w:r>
-        <w:t>1.5 Documentation (in English)</w:t>
+        <w:t>2.5 Documentation (in English)</w:t>
       </w:r>
     </w:p>
     <w:p>
@@ -424,7 +483,16 @@
         <w:pStyle w:val="ListBullet"/>
       </w:pPr>
       <w:r>
-        <w:t>Control system operation and maintenance manual;</w:t>
+        <w:t xml:space="preserve">Control system operation and maintenance manual, including the </w:t>
+      </w:r>
+      <w:r>
+        <w:rPr>
+          <w:b/>
+        </w:rPr>
+        <w:t>scheduled maintenance plan</w:t>
+      </w:r>
+      <w:r>
+        <w:t xml:space="preserve"> of the new control system (checks and intervals), suitable to support the Purchaser's log book and inspection duties under AS 3533.2;</w:t>
       </w:r>
     </w:p>
     <w:p>
@@ -456,7 +524,7 @@
         <w:pStyle w:val="Heading3"/>
       </w:pPr>
       <w:r>
-        <w:t>1.6 Services Included</w:t>
+        <w:t>2.6 Services Included</w:t>
       </w:r>
     </w:p>
     <w:p>
@@ -504,7 +572,7 @@
         <w:pStyle w:val="Heading2"/>
       </w:pPr>
       <w:r>
-        <w:t>2. Exclusions</w:t>
+        <w:t>3. Exclusions</w:t>
       </w:r>
     </w:p>
     <w:p>
@@ -517,7 +585,7 @@
         <w:pStyle w:val="ListBullet"/>
       </w:pPr>
       <w:r>
-        <w:t>Disconnection, removal and disposal of the existing control cabinet, console and wiring;</w:t>
+        <w:t>Disconnection, removal and disposal of the existing cabinets, console and wiring;</w:t>
       </w:r>
     </w:p>
     <w:p>
@@ -534,6 +602,14 @@
       </w:pPr>
       <w:r>
         <w:t>On-site electrical installation works, which shall be performed by a licensed electrical contractor acc. to AS/NZS 3000 under our supervision;</w:t>
+      </w:r>
+    </w:p>
+    <w:p>
+      <w:pPr>
+        <w:pStyle w:val="ListBullet"/>
+      </w:pPr>
+      <w:r>
+        <w:t>Overhaul or replacement of mechanical, structural and hydraulic components (motors, brakes, pump, valves, cylinders, hoses, slip-ring collector) — see Options;</w:t>
       </w:r>
     </w:p>
     <w:p>
@@ -581,7 +657,7 @@
         <w:pStyle w:val="Heading2"/>
       </w:pPr>
       <w:r>
-        <w:t>3. Price</w:t>
+        <w:t>4. Price</w:t>
       </w:r>
     </w:p>
     <w:tbl>
@@ -653,7 +729,7 @@
           </w:tcPr>
           <w:p>
             <w:r>
-              <w:t>Main control cabinet complete with safety PLC, VFDs, switchgear, UPS and VPN router (item 1.1)</w:t>
+              <w:t>Main control cabinet complete with safety PLC, No. 2 VFDs with braking resistors, soft starter, switchgear, light-lines distribution, UPS, 24 V dc PSU and VPN router (item 2.1)</w:t>
             </w:r>
           </w:p>
         </w:tc>
@@ -685,7 +761,7 @@
           </w:tcPr>
           <w:p>
             <w:r>
-              <w:t>Operator console with HMI (item 1.2)</w:t>
+              <w:t>Operator console with HMI (item 2.2)</w:t>
             </w:r>
           </w:p>
         </w:tc>
@@ -717,7 +793,7 @@
           </w:tcPr>
           <w:p>
             <w:r>
-              <w:t>Field equipment set (item 1.3)</w:t>
+              <w:t>Hydraulic unit distribution panel and field equipment set (item 2.3)</w:t>
             </w:r>
           </w:p>
         </w:tc>
@@ -749,7 +825,7 @@
           </w:tcPr>
           <w:p>
             <w:r>
-              <w:t>Application software, safety validation and engineering (item 1.4)</w:t>
+              <w:t>Application software, safety validation and engineering (item 2.4)</w:t>
             </w:r>
           </w:p>
         </w:tc>
@@ -781,7 +857,7 @@
           </w:tcPr>
           <w:p>
             <w:r>
-              <w:t>Documentation package (item 1.5)</w:t>
+              <w:t>Documentation package (item 2.5)</w:t>
             </w:r>
           </w:p>
         </w:tc>
@@ -813,7 +889,7 @@
           </w:tcPr>
           <w:p>
             <w:r>
-              <w:t>FAT, packing and freight to Sydney [Incoterms] (item 1.6)</w:t>
+              <w:t>FAT, packing and freight to Sydney [Incoterms] (item 2.6)</w:t>
             </w:r>
           </w:p>
         </w:tc>
@@ -845,7 +921,7 @@
           </w:tcPr>
           <w:p>
             <w:r>
-              <w:t>Site commissioning, testing and training – [X] working days, [N] technician(s) (item 1.6)</w:t>
+              <w:t>Site commissioning, testing and training – [X] working days, [N] technician(s) (item 2.6)</w:t>
             </w:r>
           </w:p>
         </w:tc>
@@ -906,7 +982,7 @@
         <w:pStyle w:val="Heading3"/>
       </w:pPr>
       <w:r>
-        <w:t>3.1 Options (not included in the total price)</w:t>
+        <w:t>4.1 Options (not included in the total price)</w:t>
       </w:r>
     </w:p>
     <w:tbl>
@@ -978,7 +1054,7 @@
           </w:tcPr>
           <w:p>
             <w:r>
-              <w:t>Recommended spare parts package (PLC CPU, I/O modules, HMI panel, one VFD, sensors set)</w:t>
+              <w:t>Recommended spare parts package (PLC CPU, fail-safe I/O modules, HMI panel, one VFD, sensors set, solenoid valve coils)</w:t>
             </w:r>
           </w:p>
         </w:tc>
@@ -1010,7 +1086,7 @@
           </w:tcPr>
           <w:p>
             <w:r>
-              <w:t>Wind speed sensor (anemometer) with automatic operating limits managed by the control system</w:t>
+              <w:t>Overhaul of the slip-ring collector (new brushes, cleaning, insulation test) during commissioning shutdown</w:t>
             </w:r>
           </w:p>
         </w:tc>
@@ -1042,7 +1118,7 @@
           </w:tcPr>
           <w:p>
             <w:r>
-              <w:t>Remote assistance service contract, [24] months from commissioning</w:t>
+              <w:t>Wind speed sensor (anemometer) with automatic operating limits managed by the control system (ride operating limit 15 m/s as per O&amp;M manual, currently assessed by Beaufort scale where no wind monitoring device is installed)</w:t>
             </w:r>
           </w:p>
         </w:tc>
@@ -1074,6 +1150,70 @@
           </w:tcPr>
           <w:p>
             <w:r>
+              <w:t>Remote assistance service contract, [24] months from commissioning</w:t>
+            </w:r>
+          </w:p>
+        </w:tc>
+        <w:tc>
+          <w:tcPr>
+            <w:tcW w:type="dxa" w:w="3213"/>
+          </w:tcPr>
+          <w:p>
+            <w:r>
+              <w:t>€ [_______]</w:t>
+            </w:r>
+          </w:p>
+        </w:tc>
+      </w:tr>
+      <w:tr>
+        <w:tc>
+          <w:tcPr>
+            <w:tcW w:type="dxa" w:w="3213"/>
+          </w:tcPr>
+          <w:p>
+            <w:r>
+              <w:t>E</w:t>
+            </w:r>
+          </w:p>
+        </w:tc>
+        <w:tc>
+          <w:tcPr>
+            <w:tcW w:type="dxa" w:w="3213"/>
+          </w:tcPr>
+          <w:p>
+            <w:r>
+              <w:t>Annual inspection contract: safety functions proof test acc. to EN ISO 13849-2, parameter backup, instrument calibration check — in support of the AS 3533.2 annual inspection</w:t>
+            </w:r>
+          </w:p>
+        </w:tc>
+        <w:tc>
+          <w:tcPr>
+            <w:tcW w:type="dxa" w:w="3213"/>
+          </w:tcPr>
+          <w:p>
+            <w:r>
+              <w:t>€ [_______]</w:t>
+            </w:r>
+          </w:p>
+        </w:tc>
+      </w:tr>
+      <w:tr>
+        <w:tc>
+          <w:tcPr>
+            <w:tcW w:type="dxa" w:w="3213"/>
+          </w:tcPr>
+          <w:p>
+            <w:r>
+              <w:t>F</w:t>
+            </w:r>
+          </w:p>
+        </w:tc>
+        <w:tc>
+          <w:tcPr>
+            <w:tcW w:type="dxa" w:w="3213"/>
+          </w:tcPr>
+          <w:p>
+            <w:r>
               <w:t>Additional on-site working day of P&amp;B technician (per day, per technician)</w:t>
             </w:r>
           </w:p>
@@ -1096,7 +1236,7 @@
         <w:pStyle w:val="Heading2"/>
       </w:pPr>
       <w:r>
-        <w:t>4. Terms and Conditions</w:t>
+        <w:t>5. Terms and Conditions</w:t>
       </w:r>
     </w:p>
     <w:p>

</xml_diff>